<commit_message>
docs: V4.2.2 执行教训追加 — WiFi OFFLINE 5条新教训
</commit_message>
<xml_diff>
--- a/Claude_Files/docs/embedded-architect-system-prompt.docx
+++ b/Claude_Files/docs/embedded-architect-system-prompt.docx
@@ -7756,7 +7756,803 @@
           <w:sz w:val="28"/>
           <w:szCs w:val="28"/>
         </w:rPr>
-        <w:t xml:space="preserve">4.4 "更新全部内容"执行检查清单</w:t>
+        <w:t xml:space="preserve">4.4 2026-06-17 (#4): V4.2.2 WiFi OFFLINE 开发教训</w:t>
+      </w:r>
+    </w:p>
+    <w:p/>
+    <w:p/>
+    <w:tbl>
+      <w:tblPr>
+        <w:tblW w:type="dxa" w:w="9072"/>
+        <w:tblBorders>
+          <w:top w:val="single" w:color="auto" w:sz="4"/>
+          <w:left w:val="single" w:color="auto" w:sz="4"/>
+          <w:bottom w:val="single" w:color="auto" w:sz="4"/>
+          <w:right w:val="single" w:color="auto" w:sz="4"/>
+          <w:insideH w:val="single" w:color="auto" w:sz="4"/>
+          <w:insideV w:val="single" w:color="auto" w:sz="4"/>
+        </w:tblBorders>
+      </w:tblPr>
+      <w:tblGrid>
+        <w:gridCol w:w="2268"/>
+        <w:gridCol w:w="2268"/>
+        <w:gridCol w:w="2268"/>
+        <w:gridCol w:w="2268"/>
+      </w:tblGrid>
+      <w:tr>
+        <w:tc>
+          <w:tcPr>
+            <w:tcW w:type="dxa" w:w="2268"/>
+            <w:tcBorders>
+              <w:top w:val="single" w:color="CCCCCC" w:sz="1"/>
+              <w:left w:val="single" w:color="CCCCCC" w:sz="1"/>
+              <w:bottom w:val="single" w:color="CCCCCC" w:sz="1"/>
+              <w:right w:val="single" w:color="CCCCCC" w:sz="1"/>
+            </w:tcBorders>
+            <w:shd w:fill="D5E8F0" w:val="clear"/>
+            <w:tcMar>
+              <w:top w:type="dxa" w:w="60"/>
+              <w:left w:type="dxa" w:w="100"/>
+              <w:bottom w:type="dxa" w:w="60"/>
+              <w:right w:type="dxa" w:w="100"/>
+            </w:tcMar>
+          </w:tcPr>
+          <w:p>
+            <w:r>
+              <w:rPr>
+                <w:rFonts w:ascii="SimSun" w:cs="SimSun" w:eastAsia="SimSun" w:hAnsi="SimSun"/>
+                <w:b/>
+                <w:bCs/>
+                <w:color w:val="333333"/>
+                <w:sz w:val="20"/>
+                <w:szCs w:val="20"/>
+              </w:rPr>
+              <w:t xml:space="preserve">#</w:t>
+            </w:r>
+          </w:p>
+        </w:tc>
+        <w:tc>
+          <w:tcPr>
+            <w:tcW w:type="dxa" w:w="2268"/>
+            <w:tcBorders>
+              <w:top w:val="single" w:color="CCCCCC" w:sz="1"/>
+              <w:left w:val="single" w:color="CCCCCC" w:sz="1"/>
+              <w:bottom w:val="single" w:color="CCCCCC" w:sz="1"/>
+              <w:right w:val="single" w:color="CCCCCC" w:sz="1"/>
+            </w:tcBorders>
+            <w:shd w:fill="D5E8F0" w:val="clear"/>
+            <w:tcMar>
+              <w:top w:type="dxa" w:w="60"/>
+              <w:left w:type="dxa" w:w="100"/>
+              <w:bottom w:type="dxa" w:w="60"/>
+              <w:right w:type="dxa" w:w="100"/>
+            </w:tcMar>
+          </w:tcPr>
+          <w:p>
+            <w:r>
+              <w:rPr>
+                <w:rFonts w:ascii="SimSun" w:cs="SimSun" w:eastAsia="SimSun" w:hAnsi="SimSun"/>
+                <w:b/>
+                <w:bCs/>
+                <w:color w:val="333333"/>
+                <w:sz w:val="20"/>
+                <w:szCs w:val="20"/>
+              </w:rPr>
+              <w:t xml:space="preserve">问题</w:t>
+            </w:r>
+          </w:p>
+        </w:tc>
+        <w:tc>
+          <w:tcPr>
+            <w:tcW w:type="dxa" w:w="2268"/>
+            <w:tcBorders>
+              <w:top w:val="single" w:color="CCCCCC" w:sz="1"/>
+              <w:left w:val="single" w:color="CCCCCC" w:sz="1"/>
+              <w:bottom w:val="single" w:color="CCCCCC" w:sz="1"/>
+              <w:right w:val="single" w:color="CCCCCC" w:sz="1"/>
+            </w:tcBorders>
+            <w:shd w:fill="D5E8F0" w:val="clear"/>
+            <w:tcMar>
+              <w:top w:type="dxa" w:w="60"/>
+              <w:left w:type="dxa" w:w="100"/>
+              <w:bottom w:type="dxa" w:w="60"/>
+              <w:right w:type="dxa" w:w="100"/>
+            </w:tcMar>
+          </w:tcPr>
+          <w:p>
+            <w:r>
+              <w:rPr>
+                <w:rFonts w:ascii="SimSun" w:cs="SimSun" w:eastAsia="SimSun" w:hAnsi="SimSun"/>
+                <w:b/>
+                <w:bCs/>
+                <w:color w:val="333333"/>
+                <w:sz w:val="20"/>
+                <w:szCs w:val="20"/>
+              </w:rPr>
+              <w:t xml:space="preserve">根因</w:t>
+            </w:r>
+          </w:p>
+        </w:tc>
+        <w:tc>
+          <w:tcPr>
+            <w:tcW w:type="dxa" w:w="2268"/>
+            <w:tcBorders>
+              <w:top w:val="single" w:color="CCCCCC" w:sz="1"/>
+              <w:left w:val="single" w:color="CCCCCC" w:sz="1"/>
+              <w:bottom w:val="single" w:color="CCCCCC" w:sz="1"/>
+              <w:right w:val="single" w:color="CCCCCC" w:sz="1"/>
+            </w:tcBorders>
+            <w:shd w:fill="D5E8F0" w:val="clear"/>
+            <w:tcMar>
+              <w:top w:type="dxa" w:w="60"/>
+              <w:left w:type="dxa" w:w="100"/>
+              <w:bottom w:type="dxa" w:w="60"/>
+              <w:right w:type="dxa" w:w="100"/>
+            </w:tcMar>
+          </w:tcPr>
+          <w:p>
+            <w:r>
+              <w:rPr>
+                <w:rFonts w:ascii="SimSun" w:cs="SimSun" w:eastAsia="SimSun" w:hAnsi="SimSun"/>
+                <w:b/>
+                <w:bCs/>
+                <w:color w:val="333333"/>
+                <w:sz w:val="20"/>
+                <w:szCs w:val="20"/>
+              </w:rPr>
+              <w:t xml:space="preserve">预防规则</w:t>
+            </w:r>
+          </w:p>
+        </w:tc>
+      </w:tr>
+      <w:tr>
+        <w:tc>
+          <w:tcPr>
+            <w:tcW w:type="dxa" w:w="2268"/>
+            <w:tcBorders>
+              <w:top w:val="single" w:color="CCCCCC" w:sz="1"/>
+              <w:left w:val="single" w:color="CCCCCC" w:sz="1"/>
+              <w:bottom w:val="single" w:color="CCCCCC" w:sz="1"/>
+              <w:right w:val="single" w:color="CCCCCC" w:sz="1"/>
+            </w:tcBorders>
+            <w:tcMar>
+              <w:top w:type="dxa" w:w="60"/>
+              <w:left w:type="dxa" w:w="100"/>
+              <w:bottom w:type="dxa" w:w="60"/>
+              <w:right w:type="dxa" w:w="100"/>
+            </w:tcMar>
+          </w:tcPr>
+          <w:p>
+            <w:pPr>
+              <w:spacing w:line="288"/>
+            </w:pPr>
+            <w:r>
+              <w:rPr>
+                <w:rFonts w:ascii="SimSun" w:cs="SimSun" w:eastAsia="SimSun" w:hAnsi="SimSun"/>
+                <w:color w:val="333333"/>
+                <w:sz w:val="20"/>
+                <w:szCs w:val="20"/>
+              </w:rPr>
+              <w:t xml:space="preserve">19</w:t>
+            </w:r>
+          </w:p>
+        </w:tc>
+        <w:tc>
+          <w:tcPr>
+            <w:tcW w:type="dxa" w:w="2268"/>
+            <w:tcBorders>
+              <w:top w:val="single" w:color="CCCCCC" w:sz="1"/>
+              <w:left w:val="single" w:color="CCCCCC" w:sz="1"/>
+              <w:bottom w:val="single" w:color="CCCCCC" w:sz="1"/>
+              <w:right w:val="single" w:color="CCCCCC" w:sz="1"/>
+            </w:tcBorders>
+            <w:tcMar>
+              <w:top w:type="dxa" w:w="60"/>
+              <w:left w:type="dxa" w:w="100"/>
+              <w:bottom w:type="dxa" w:w="60"/>
+              <w:right w:type="dxa" w:w="100"/>
+            </w:tcMar>
+          </w:tcPr>
+          <w:p>
+            <w:pPr>
+              <w:spacing w:line="288"/>
+            </w:pPr>
+            <w:r>
+              <w:rPr>
+                <w:rFonts w:ascii="SimSun" w:cs="SimSun" w:eastAsia="SimSun" w:hAnsi="SimSun"/>
+                <w:color w:val="333333"/>
+                <w:sz w:val="20"/>
+                <w:szCs w:val="20"/>
+              </w:rPr>
+              <w:t xml:space="preserve">首次推送后"连不上WiFi"</w:t>
+            </w:r>
+          </w:p>
+        </w:tc>
+        <w:tc>
+          <w:tcPr>
+            <w:tcW w:type="dxa" w:w="2268"/>
+            <w:tcBorders>
+              <w:top w:val="single" w:color="CCCCCC" w:sz="1"/>
+              <w:left w:val="single" w:color="CCCCCC" w:sz="1"/>
+              <w:bottom w:val="single" w:color="CCCCCC" w:sz="1"/>
+              <w:right w:val="single" w:color="CCCCCC" w:sz="1"/>
+            </w:tcBorders>
+            <w:tcMar>
+              <w:top w:type="dxa" w:w="60"/>
+              <w:left w:type="dxa" w:w="100"/>
+              <w:bottom w:type="dxa" w:w="60"/>
+              <w:right w:type="dxa" w:w="100"/>
+            </w:tcMar>
+          </w:tcPr>
+          <w:p>
+            <w:pPr>
+              <w:spacing w:line="288"/>
+            </w:pPr>
+            <w:r>
+              <w:rPr>
+                <w:rFonts w:ascii="SimSun" w:cs="SimSun" w:eastAsia="SimSun" w:hAnsi="SimSun"/>
+                <w:color w:val="333333"/>
+                <w:sz w:val="20"/>
+                <w:szCs w:val="20"/>
+              </w:rPr>
+              <w:t xml:space="preserve">每次重试都发硬件RST→4s BOOT_WAIT→5次重试全浪费在等待</w:t>
+            </w:r>
+          </w:p>
+        </w:tc>
+        <w:tc>
+          <w:tcPr>
+            <w:tcW w:type="dxa" w:w="2268"/>
+            <w:tcBorders>
+              <w:top w:val="single" w:color="CCCCCC" w:sz="1"/>
+              <w:left w:val="single" w:color="CCCCCC" w:sz="1"/>
+              <w:bottom w:val="single" w:color="CCCCCC" w:sz="1"/>
+              <w:right w:val="single" w:color="CCCCCC" w:sz="1"/>
+            </w:tcBorders>
+            <w:tcMar>
+              <w:top w:type="dxa" w:w="60"/>
+              <w:left w:type="dxa" w:w="100"/>
+              <w:bottom w:type="dxa" w:w="60"/>
+              <w:right w:type="dxa" w:w="100"/>
+            </w:tcMar>
+          </w:tcPr>
+          <w:p>
+            <w:pPr>
+              <w:spacing w:line="288"/>
+            </w:pPr>
+            <w:r>
+              <w:rPr>
+                <w:rFonts w:ascii="SimSun" w:cs="SimSun" w:eastAsia="SimSun" w:hAnsi="SimSun"/>
+                <w:color w:val="333333"/>
+                <w:sz w:val="20"/>
+                <w:szCs w:val="20"/>
+              </w:rPr>
+              <w:t xml:space="preserve">**重试/恢复路径禁止硬件RST**: ESP已在运行的连接恢复场景, 只切状态不碰硬件</w:t>
+            </w:r>
+          </w:p>
+        </w:tc>
+      </w:tr>
+      <w:tr>
+        <w:tc>
+          <w:tcPr>
+            <w:tcW w:type="dxa" w:w="2268"/>
+            <w:tcBorders>
+              <w:top w:val="single" w:color="CCCCCC" w:sz="1"/>
+              <w:left w:val="single" w:color="CCCCCC" w:sz="1"/>
+              <w:bottom w:val="single" w:color="CCCCCC" w:sz="1"/>
+              <w:right w:val="single" w:color="CCCCCC" w:sz="1"/>
+            </w:tcBorders>
+            <w:tcMar>
+              <w:top w:type="dxa" w:w="60"/>
+              <w:left w:type="dxa" w:w="100"/>
+              <w:bottom w:type="dxa" w:w="60"/>
+              <w:right w:type="dxa" w:w="100"/>
+            </w:tcMar>
+          </w:tcPr>
+          <w:p>
+            <w:pPr>
+              <w:spacing w:line="288"/>
+            </w:pPr>
+            <w:r>
+              <w:rPr>
+                <w:rFonts w:ascii="SimSun" w:cs="SimSun" w:eastAsia="SimSun" w:hAnsi="SimSun"/>
+                <w:color w:val="333333"/>
+                <w:sz w:val="20"/>
+                <w:szCs w:val="20"/>
+              </w:rPr>
+              <w:t xml:space="preserve">20</w:t>
+            </w:r>
+          </w:p>
+        </w:tc>
+        <w:tc>
+          <w:tcPr>
+            <w:tcW w:type="dxa" w:w="2268"/>
+            <w:tcBorders>
+              <w:top w:val="single" w:color="CCCCCC" w:sz="1"/>
+              <w:left w:val="single" w:color="CCCCCC" w:sz="1"/>
+              <w:bottom w:val="single" w:color="CCCCCC" w:sz="1"/>
+              <w:right w:val="single" w:color="CCCCCC" w:sz="1"/>
+            </w:tcBorders>
+            <w:tcMar>
+              <w:top w:type="dxa" w:w="60"/>
+              <w:left w:type="dxa" w:w="100"/>
+              <w:bottom w:type="dxa" w:w="60"/>
+              <w:right w:type="dxa" w:w="100"/>
+            </w:tcMar>
+          </w:tcPr>
+          <w:p>
+            <w:pPr>
+              <w:spacing w:line="288"/>
+            </w:pPr>
+            <w:r>
+              <w:rPr>
+                <w:rFonts w:ascii="SimSun" w:cs="SimSun" w:eastAsia="SimSun" w:hAnsi="SimSun"/>
+                <w:color w:val="333333"/>
+                <w:sz w:val="20"/>
+                <w:szCs w:val="20"/>
+              </w:rPr>
+              <w:t xml:space="preserve">OFFLINE_PASSIVE 嗅探在 Is_Ready() 之后才执行</w:t>
+            </w:r>
+          </w:p>
+        </w:tc>
+        <w:tc>
+          <w:tcPr>
+            <w:tcW w:type="dxa" w:w="2268"/>
+            <w:tcBorders>
+              <w:top w:val="single" w:color="CCCCCC" w:sz="1"/>
+              <w:left w:val="single" w:color="CCCCCC" w:sz="1"/>
+              <w:bottom w:val="single" w:color="CCCCCC" w:sz="1"/>
+              <w:right w:val="single" w:color="CCCCCC" w:sz="1"/>
+            </w:tcBorders>
+            <w:tcMar>
+              <w:top w:type="dxa" w:w="60"/>
+              <w:left w:type="dxa" w:w="100"/>
+              <w:bottom w:type="dxa" w:w="60"/>
+              <w:right w:type="dxa" w:w="100"/>
+            </w:tcMar>
+          </w:tcPr>
+          <w:p>
+            <w:pPr>
+              <w:spacing w:line="288"/>
+            </w:pPr>
+            <w:r>
+              <w:rPr>
+                <w:rFonts w:ascii="SimSun" w:cs="SimSun" w:eastAsia="SimSun" w:hAnsi="SimSun"/>
+                <w:color w:val="333333"/>
+                <w:sz w:val="20"/>
+                <w:szCs w:val="20"/>
+              </w:rPr>
+              <w:t xml:space="preserve">代码放在 App_Network_Task 的 `if (!Is_Ready()) return` 之后</w:t>
+            </w:r>
+          </w:p>
+        </w:tc>
+        <w:tc>
+          <w:tcPr>
+            <w:tcW w:type="dxa" w:w="2268"/>
+            <w:tcBorders>
+              <w:top w:val="single" w:color="CCCCCC" w:sz="1"/>
+              <w:left w:val="single" w:color="CCCCCC" w:sz="1"/>
+              <w:bottom w:val="single" w:color="CCCCCC" w:sz="1"/>
+              <w:right w:val="single" w:color="CCCCCC" w:sz="1"/>
+            </w:tcBorders>
+            <w:tcMar>
+              <w:top w:type="dxa" w:w="60"/>
+              <w:left w:type="dxa" w:w="100"/>
+              <w:bottom w:type="dxa" w:w="60"/>
+              <w:right w:type="dxa" w:w="100"/>
+            </w:tcMar>
+          </w:tcPr>
+          <w:p>
+            <w:pPr>
+              <w:spacing w:line="288"/>
+            </w:pPr>
+            <w:r>
+              <w:rPr>
+                <w:rFonts w:ascii="SimSun" w:cs="SimSun" w:eastAsia="SimSun" w:hAnsi="SimSun"/>
+                <w:color w:val="333333"/>
+                <w:sz w:val="20"/>
+                <w:szCs w:val="20"/>
+              </w:rPr>
+              <w:t xml:space="preserve">**离线嗅探检查必须在 Is_Ready() 之前或独立路径**: 依赖串口读帧的逻辑不能躲在硬件就绪检查后面</w:t>
+            </w:r>
+          </w:p>
+        </w:tc>
+      </w:tr>
+      <w:tr>
+        <w:tc>
+          <w:tcPr>
+            <w:tcW w:type="dxa" w:w="2268"/>
+            <w:tcBorders>
+              <w:top w:val="single" w:color="CCCCCC" w:sz="1"/>
+              <w:left w:val="single" w:color="CCCCCC" w:sz="1"/>
+              <w:bottom w:val="single" w:color="CCCCCC" w:sz="1"/>
+              <w:right w:val="single" w:color="CCCCCC" w:sz="1"/>
+            </w:tcBorders>
+            <w:tcMar>
+              <w:top w:type="dxa" w:w="60"/>
+              <w:left w:type="dxa" w:w="100"/>
+              <w:bottom w:type="dxa" w:w="60"/>
+              <w:right w:type="dxa" w:w="100"/>
+            </w:tcMar>
+          </w:tcPr>
+          <w:p>
+            <w:pPr>
+              <w:spacing w:line="288"/>
+            </w:pPr>
+            <w:r>
+              <w:rPr>
+                <w:rFonts w:ascii="SimSun" w:cs="SimSun" w:eastAsia="SimSun" w:hAnsi="SimSun"/>
+                <w:color w:val="333333"/>
+                <w:sz w:val="20"/>
+                <w:szCs w:val="20"/>
+              </w:rPr>
+              <w:t xml:space="preserve">21</w:t>
+            </w:r>
+          </w:p>
+        </w:tc>
+        <w:tc>
+          <w:tcPr>
+            <w:tcW w:type="dxa" w:w="2268"/>
+            <w:tcBorders>
+              <w:top w:val="single" w:color="CCCCCC" w:sz="1"/>
+              <w:left w:val="single" w:color="CCCCCC" w:sz="1"/>
+              <w:bottom w:val="single" w:color="CCCCCC" w:sz="1"/>
+              <w:right w:val="single" w:color="CCCCCC" w:sz="1"/>
+            </w:tcBorders>
+            <w:tcMar>
+              <w:top w:type="dxa" w:w="60"/>
+              <w:left w:type="dxa" w:w="100"/>
+              <w:bottom w:type="dxa" w:w="60"/>
+              <w:right w:type="dxa" w:w="100"/>
+            </w:tcMar>
+          </w:tcPr>
+          <w:p>
+            <w:pPr>
+              <w:spacing w:line="288"/>
+            </w:pPr>
+            <w:r>
+              <w:rPr>
+                <w:rFonts w:ascii="SimSun" w:cs="SimSun" w:eastAsia="SimSun" w:hAnsi="SimSun"/>
+                <w:color w:val="333333"/>
+                <w:sz w:val="20"/>
+                <w:szCs w:val="20"/>
+              </w:rPr>
+              <w:t xml:space="preserve">`s_no_wifi_mode` 和 `App_Network_Is_Offline()` 语义重叠</w:t>
+            </w:r>
+          </w:p>
+        </w:tc>
+        <w:tc>
+          <w:tcPr>
+            <w:tcW w:type="dxa" w:w="2268"/>
+            <w:tcBorders>
+              <w:top w:val="single" w:color="CCCCCC" w:sz="1"/>
+              <w:left w:val="single" w:color="CCCCCC" w:sz="1"/>
+              <w:bottom w:val="single" w:color="CCCCCC" w:sz="1"/>
+              <w:right w:val="single" w:color="CCCCCC" w:sz="1"/>
+            </w:tcBorders>
+            <w:tcMar>
+              <w:top w:type="dxa" w:w="60"/>
+              <w:left w:type="dxa" w:w="100"/>
+              <w:bottom w:type="dxa" w:w="60"/>
+              <w:right w:type="dxa" w:w="100"/>
+            </w:tcMar>
+          </w:tcPr>
+          <w:p>
+            <w:pPr>
+              <w:spacing w:line="288"/>
+            </w:pPr>
+            <w:r>
+              <w:rPr>
+                <w:rFonts w:ascii="SimSun" w:cs="SimSun" w:eastAsia="SimSun" w:hAnsi="SimSun"/>
+                <w:color w:val="333333"/>
+                <w:sz w:val="20"/>
+                <w:szCs w:val="20"/>
+              </w:rPr>
+              <w:t xml:space="preserve">旧代码的 NoWiFi 标记和新 OFFLINE 状态机共存但未收敛</w:t>
+            </w:r>
+          </w:p>
+        </w:tc>
+        <w:tc>
+          <w:tcPr>
+            <w:tcW w:type="dxa" w:w="2268"/>
+            <w:tcBorders>
+              <w:top w:val="single" w:color="CCCCCC" w:sz="1"/>
+              <w:left w:val="single" w:color="CCCCCC" w:sz="1"/>
+              <w:bottom w:val="single" w:color="CCCCCC" w:sz="1"/>
+              <w:right w:val="single" w:color="CCCCCC" w:sz="1"/>
+            </w:tcBorders>
+            <w:tcMar>
+              <w:top w:type="dxa" w:w="60"/>
+              <w:left w:type="dxa" w:w="100"/>
+              <w:bottom w:type="dxa" w:w="60"/>
+              <w:right w:type="dxa" w:w="100"/>
+            </w:tcMar>
+          </w:tcPr>
+          <w:p>
+            <w:pPr>
+              <w:spacing w:line="288"/>
+            </w:pPr>
+            <w:r>
+              <w:rPr>
+                <w:rFonts w:ascii="SimSun" w:cs="SimSun" w:eastAsia="SimSun" w:hAnsi="SimSun"/>
+                <w:color w:val="333333"/>
+                <w:sz w:val="20"/>
+                <w:szCs w:val="20"/>
+              </w:rPr>
+              <w:t xml:space="preserve">**大功能新增时必须全局 grep 旧标记的所有引用**, 决定是删除/替换/还是共存</w:t>
+            </w:r>
+          </w:p>
+        </w:tc>
+      </w:tr>
+      <w:tr>
+        <w:tc>
+          <w:tcPr>
+            <w:tcW w:type="dxa" w:w="2268"/>
+            <w:tcBorders>
+              <w:top w:val="single" w:color="CCCCCC" w:sz="1"/>
+              <w:left w:val="single" w:color="CCCCCC" w:sz="1"/>
+              <w:bottom w:val="single" w:color="CCCCCC" w:sz="1"/>
+              <w:right w:val="single" w:color="CCCCCC" w:sz="1"/>
+            </w:tcBorders>
+            <w:tcMar>
+              <w:top w:type="dxa" w:w="60"/>
+              <w:left w:type="dxa" w:w="100"/>
+              <w:bottom w:type="dxa" w:w="60"/>
+              <w:right w:type="dxa" w:w="100"/>
+            </w:tcMar>
+          </w:tcPr>
+          <w:p>
+            <w:pPr>
+              <w:spacing w:line="288"/>
+            </w:pPr>
+            <w:r>
+              <w:rPr>
+                <w:rFonts w:ascii="SimSun" w:cs="SimSun" w:eastAsia="SimSun" w:hAnsi="SimSun"/>
+                <w:color w:val="333333"/>
+                <w:sz w:val="20"/>
+                <w:szCs w:val="20"/>
+              </w:rPr>
+              <w:t xml:space="preserve">22</w:t>
+            </w:r>
+          </w:p>
+        </w:tc>
+        <w:tc>
+          <w:tcPr>
+            <w:tcW w:type="dxa" w:w="2268"/>
+            <w:tcBorders>
+              <w:top w:val="single" w:color="CCCCCC" w:sz="1"/>
+              <w:left w:val="single" w:color="CCCCCC" w:sz="1"/>
+              <w:bottom w:val="single" w:color="CCCCCC" w:sz="1"/>
+              <w:right w:val="single" w:color="CCCCCC" w:sz="1"/>
+            </w:tcBorders>
+            <w:tcMar>
+              <w:top w:type="dxa" w:w="60"/>
+              <w:left w:type="dxa" w:w="100"/>
+              <w:bottom w:type="dxa" w:w="60"/>
+              <w:right w:type="dxa" w:w="100"/>
+            </w:tcMar>
+          </w:tcPr>
+          <w:p>
+            <w:pPr>
+              <w:spacing w:line="288"/>
+            </w:pPr>
+            <w:r>
+              <w:rPr>
+                <w:rFonts w:ascii="SimSun" w:cs="SimSun" w:eastAsia="SimSun" w:hAnsi="SimSun"/>
+                <w:color w:val="333333"/>
+                <w:sz w:val="20"/>
+                <w:szCs w:val="20"/>
+              </w:rPr>
+              <w:t xml:space="preserve">审查报告 CLAUDE.md 只列了 3 行 change summary, 行数还是旧的</w:t>
+            </w:r>
+          </w:p>
+        </w:tc>
+        <w:tc>
+          <w:tcPr>
+            <w:tcW w:type="dxa" w:w="2268"/>
+            <w:tcBorders>
+              <w:top w:val="single" w:color="CCCCCC" w:sz="1"/>
+              <w:left w:val="single" w:color="CCCCCC" w:sz="1"/>
+              <w:bottom w:val="single" w:color="CCCCCC" w:sz="1"/>
+              <w:right w:val="single" w:color="CCCCCC" w:sz="1"/>
+            </w:tcBorders>
+            <w:tcMar>
+              <w:top w:type="dxa" w:w="60"/>
+              <w:left w:type="dxa" w:w="100"/>
+              <w:bottom w:type="dxa" w:w="60"/>
+              <w:right w:type="dxa" w:w="100"/>
+            </w:tcMar>
+          </w:tcPr>
+          <w:p>
+            <w:pPr>
+              <w:spacing w:line="288"/>
+            </w:pPr>
+            <w:r>
+              <w:rPr>
+                <w:rFonts w:ascii="SimSun" w:cs="SimSun" w:eastAsia="SimSun" w:hAnsi="SimSun"/>
+                <w:color w:val="333333"/>
+                <w:sz w:val="20"/>
+                <w:szCs w:val="20"/>
+              </w:rPr>
+              <w:t xml:space="preserve">写审查报告时只看了 App_Network.c 没跑 `wc -l` 全平台统计</w:t>
+            </w:r>
+          </w:p>
+        </w:tc>
+        <w:tc>
+          <w:tcPr>
+            <w:tcW w:type="dxa" w:w="2268"/>
+            <w:tcBorders>
+              <w:top w:val="single" w:color="CCCCCC" w:sz="1"/>
+              <w:left w:val="single" w:color="CCCCCC" w:sz="1"/>
+              <w:bottom w:val="single" w:color="CCCCCC" w:sz="1"/>
+              <w:right w:val="single" w:color="CCCCCC" w:sz="1"/>
+            </w:tcBorders>
+            <w:tcMar>
+              <w:top w:type="dxa" w:w="60"/>
+              <w:left w:type="dxa" w:w="100"/>
+              <w:bottom w:type="dxa" w:w="60"/>
+              <w:right w:type="dxa" w:w="100"/>
+            </w:tcMar>
+          </w:tcPr>
+          <w:p>
+            <w:pPr>
+              <w:spacing w:line="288"/>
+            </w:pPr>
+            <w:r>
+              <w:rPr>
+                <w:rFonts w:ascii="SimSun" w:cs="SimSun" w:eastAsia="SimSun" w:hAnsi="SimSun"/>
+                <w:color w:val="333333"/>
+                <w:sz w:val="20"/>
+                <w:szCs w:val="20"/>
+              </w:rPr>
+              <w:t xml:space="preserve">**每次"更新全部内容"第 1 条必须先 `wc -l` 全平台行数**, 不能靠记忆</w:t>
+            </w:r>
+          </w:p>
+        </w:tc>
+      </w:tr>
+      <w:tr>
+        <w:tc>
+          <w:tcPr>
+            <w:tcW w:type="dxa" w:w="2268"/>
+            <w:tcBorders>
+              <w:top w:val="single" w:color="CCCCCC" w:sz="1"/>
+              <w:left w:val="single" w:color="CCCCCC" w:sz="1"/>
+              <w:bottom w:val="single" w:color="CCCCCC" w:sz="1"/>
+              <w:right w:val="single" w:color="CCCCCC" w:sz="1"/>
+            </w:tcBorders>
+            <w:tcMar>
+              <w:top w:type="dxa" w:w="60"/>
+              <w:left w:type="dxa" w:w="100"/>
+              <w:bottom w:type="dxa" w:w="60"/>
+              <w:right w:type="dxa" w:w="100"/>
+            </w:tcMar>
+          </w:tcPr>
+          <w:p>
+            <w:pPr>
+              <w:spacing w:line="288"/>
+            </w:pPr>
+            <w:r>
+              <w:rPr>
+                <w:rFonts w:ascii="SimSun" w:cs="SimSun" w:eastAsia="SimSun" w:hAnsi="SimSun"/>
+                <w:color w:val="333333"/>
+                <w:sz w:val="20"/>
+                <w:szCs w:val="20"/>
+              </w:rPr>
+              <w:t xml:space="preserve">23</w:t>
+            </w:r>
+          </w:p>
+        </w:tc>
+        <w:tc>
+          <w:tcPr>
+            <w:tcW w:type="dxa" w:w="2268"/>
+            <w:tcBorders>
+              <w:top w:val="single" w:color="CCCCCC" w:sz="1"/>
+              <w:left w:val="single" w:color="CCCCCC" w:sz="1"/>
+              <w:bottom w:val="single" w:color="CCCCCC" w:sz="1"/>
+              <w:right w:val="single" w:color="CCCCCC" w:sz="1"/>
+            </w:tcBorders>
+            <w:tcMar>
+              <w:top w:type="dxa" w:w="60"/>
+              <w:left w:type="dxa" w:w="100"/>
+              <w:bottom w:type="dxa" w:w="60"/>
+              <w:right w:type="dxa" w:w="100"/>
+            </w:tcMar>
+          </w:tcPr>
+          <w:p>
+            <w:pPr>
+              <w:spacing w:line="288"/>
+            </w:pPr>
+            <w:r>
+              <w:rPr>
+                <w:rFonts w:ascii="SimSun" w:cs="SimSun" w:eastAsia="SimSun" w:hAnsi="SimSun"/>
+                <w:color w:val="333333"/>
+                <w:sz w:val="20"/>
+                <w:szCs w:val="20"/>
+              </w:rPr>
+              <w:t xml:space="preserve">`git add -A` 每次把 `.claude/settings.local.json` 和 `Target 1.BAT` 也 stage</w:t>
+            </w:r>
+          </w:p>
+        </w:tc>
+        <w:tc>
+          <w:tcPr>
+            <w:tcW w:type="dxa" w:w="2268"/>
+            <w:tcBorders>
+              <w:top w:val="single" w:color="CCCCCC" w:sz="1"/>
+              <w:left w:val="single" w:color="CCCCCC" w:sz="1"/>
+              <w:bottom w:val="single" w:color="CCCCCC" w:sz="1"/>
+              <w:right w:val="single" w:color="CCCCCC" w:sz="1"/>
+            </w:tcBorders>
+            <w:tcMar>
+              <w:top w:type="dxa" w:w="60"/>
+              <w:left w:type="dxa" w:w="100"/>
+              <w:bottom w:type="dxa" w:w="60"/>
+              <w:right w:type="dxa" w:w="100"/>
+            </w:tcMar>
+          </w:tcPr>
+          <w:p>
+            <w:pPr>
+              <w:spacing w:line="288"/>
+            </w:pPr>
+            <w:r>
+              <w:rPr>
+                <w:rFonts w:ascii="SimSun" w:cs="SimSun" w:eastAsia="SimSun" w:hAnsi="SimSun"/>
+                <w:color w:val="333333"/>
+                <w:sz w:val="20"/>
+                <w:szCs w:val="20"/>
+              </w:rPr>
+              <w:t xml:space="preserve">这两个文件有本地修改但不应提交</w:t>
+            </w:r>
+          </w:p>
+        </w:tc>
+        <w:tc>
+          <w:tcPr>
+            <w:tcW w:type="dxa" w:w="2268"/>
+            <w:tcBorders>
+              <w:top w:val="single" w:color="CCCCCC" w:sz="1"/>
+              <w:left w:val="single" w:color="CCCCCC" w:sz="1"/>
+              <w:bottom w:val="single" w:color="CCCCCC" w:sz="1"/>
+              <w:right w:val="single" w:color="CCCCCC" w:sz="1"/>
+            </w:tcBorders>
+            <w:tcMar>
+              <w:top w:type="dxa" w:w="60"/>
+              <w:left w:type="dxa" w:w="100"/>
+              <w:bottom w:type="dxa" w:w="60"/>
+              <w:right w:type="dxa" w:w="100"/>
+            </w:tcMar>
+          </w:tcPr>
+          <w:p>
+            <w:pPr>
+              <w:spacing w:line="288"/>
+            </w:pPr>
+            <w:r>
+              <w:rPr>
+                <w:rFonts w:ascii="SimSun" w:cs="SimSun" w:eastAsia="SimSun" w:hAnsi="SimSun"/>
+                <w:color w:val="333333"/>
+                <w:sz w:val="20"/>
+                <w:szCs w:val="20"/>
+              </w:rPr>
+              <w:t xml:space="preserve">**`git add` 前先 `git diff --name-only` 过滤**, 或用 `git add &lt;specific-files&gt;` 替代 `-A`</w:t>
+            </w:r>
+          </w:p>
+        </w:tc>
+      </w:tr>
+    </w:tbl>
+    <w:p/>
+    <w:p/>
+    <w:p>
+      <w:pPr>
+        <w:pStyle w:val="Heading3"/>
+        <w:spacing w:after="80" w:before="160"/>
+      </w:pPr>
+      <w:r>
+        <w:rPr>
+          <w:rFonts w:ascii="Microsoft YaHei" w:cs="Microsoft YaHei" w:eastAsia="Microsoft YaHei" w:hAnsi="Microsoft YaHei"/>
+          <w:b/>
+          <w:bCs/>
+          <w:color w:val="2B579A"/>
+          <w:sz w:val="28"/>
+          <w:szCs w:val="28"/>
+        </w:rPr>
+        <w:t xml:space="preserve">4.5 "更新全部内容"执行检查清单</w:t>
       </w:r>
     </w:p>
     <w:p/>

</xml_diff>